<commit_message>
Removed section separators, shorter questionnaire
</commit_message>
<xml_diff>
--- a/business/docs/questionnaire-FINAL.docx
+++ b/business/docs/questionnaire-FINAL.docx
@@ -63,14 +63,6 @@
         <w:t xml:space="preserve">_____________________</w:t>
       </w:r>
     </w:p>
-    <w:p>
-      <w:pPr>
-        <w:pStyle w:val="BodyText"/>
-      </w:pPr>
-      <w:r>
-        <w:t xml:space="preserve">================================================================================</w:t>
-      </w:r>
-    </w:p>
     <w:bookmarkEnd w:id="20"/>
     <w:bookmarkStart w:id="21" w:name="section-1-business-information"/>
     <w:p>
@@ -205,14 +197,6 @@
       </w:r>
       <w:r>
         <w:t xml:space="preserve">___________________________________</w:t>
-      </w:r>
-    </w:p>
-    <w:p>
-      <w:pPr>
-        <w:pStyle w:val="BodyText"/>
-      </w:pPr>
-      <w:r>
-        <w:t xml:space="preserve">================================================================================</w:t>
       </w:r>
     </w:p>
     <w:bookmarkEnd w:id="21"/>
@@ -300,14 +284,6 @@
         <w:t xml:space="preserve">- [ ] Promote a new product/service</w:t>
       </w:r>
     </w:p>
-    <w:p>
-      <w:pPr>
-        <w:pStyle w:val="BodyText"/>
-      </w:pPr>
-      <w:r>
-        <w:t xml:space="preserve">================================================================================</w:t>
-      </w:r>
-    </w:p>
     <w:bookmarkEnd w:id="22"/>
     <w:bookmarkStart w:id="23" w:name="section-3-current-presence"/>
     <w:p>
@@ -396,14 +372,6 @@
         <w:t xml:space="preserve">___________________________________</w:t>
       </w:r>
     </w:p>
-    <w:p>
-      <w:pPr>
-        <w:pStyle w:val="BodyText"/>
-      </w:pPr>
-      <w:r>
-        <w:t xml:space="preserve">================================================================================</w:t>
-      </w:r>
-    </w:p>
     <w:bookmarkEnd w:id="23"/>
     <w:bookmarkStart w:id="24" w:name="section-4-platforms-content"/>
     <w:p>
@@ -588,14 +556,6 @@
         <w:t xml:space="preserve">$_____________________/month</w:t>
       </w:r>
     </w:p>
-    <w:p>
-      <w:pPr>
-        <w:pStyle w:val="BodyText"/>
-      </w:pPr>
-      <w:r>
-        <w:t xml:space="preserve">================================================================================</w:t>
-      </w:r>
-    </w:p>
     <w:bookmarkEnd w:id="24"/>
     <w:bookmarkStart w:id="25" w:name="section-5-tracking-reporting"/>
     <w:p>
@@ -696,14 +656,6 @@
         <w:t xml:space="preserve">_____________________________________________________________________________</w:t>
       </w:r>
     </w:p>
-    <w:p>
-      <w:pPr>
-        <w:pStyle w:val="BodyText"/>
-      </w:pPr>
-      <w:r>
-        <w:t xml:space="preserve">================================================================================</w:t>
-      </w:r>
-    </w:p>
     <w:bookmarkEnd w:id="25"/>
     <w:bookmarkStart w:id="26" w:name="section-6-engagement"/>
     <w:p>
@@ -804,14 +756,6 @@
         <w:t xml:space="preserve">- Facebook: ___________________________________</w:t>
       </w:r>
     </w:p>
-    <w:p>
-      <w:pPr>
-        <w:pStyle w:val="BodyText"/>
-      </w:pPr>
-      <w:r>
-        <w:t xml:space="preserve">================================================================================</w:t>
-      </w:r>
-    </w:p>
     <w:bookmarkEnd w:id="26"/>
     <w:bookmarkStart w:id="27" w:name="section-7-email-marketing"/>
     <w:p>
@@ -894,14 +838,6 @@
         <w:t xml:space="preserve">___________________________________</w:t>
       </w:r>
     </w:p>
-    <w:p>
-      <w:pPr>
-        <w:pStyle w:val="BodyText"/>
-      </w:pPr>
-      <w:r>
-        <w:t xml:space="preserve">================================================================================</w:t>
-      </w:r>
-    </w:p>
     <w:bookmarkEnd w:id="27"/>
     <w:bookmarkStart w:id="28" w:name="section-8-integrations"/>
     <w:p>
@@ -984,14 +920,6 @@
         <w:t xml:space="preserve">[ ] Yes - Which: ___________________________________ [ ] No</w:t>
       </w:r>
     </w:p>
-    <w:p>
-      <w:pPr>
-        <w:pStyle w:val="BodyText"/>
-      </w:pPr>
-      <w:r>
-        <w:t xml:space="preserve">================================================================================</w:t>
-      </w:r>
-    </w:p>
     <w:bookmarkEnd w:id="28"/>
     <w:bookmarkStart w:id="29" w:name="section-9-budget-timing"/>
     <w:p>
@@ -1126,14 +1054,6 @@
       </w:r>
       <w:r>
         <w:t xml:space="preserve">- [ ] Ongoing marketing</w:t>
-      </w:r>
-    </w:p>
-    <w:p>
-      <w:pPr>
-        <w:pStyle w:val="BodyText"/>
-      </w:pPr>
-      <w:r>
-        <w:t xml:space="preserve">================================================================================</w:t>
       </w:r>
     </w:p>
     <w:bookmarkEnd w:id="29"/>
@@ -1207,14 +1127,6 @@
         <w:t xml:space="preserve">_____________________________________________________________________________</w:t>
       </w:r>
     </w:p>
-    <w:p>
-      <w:pPr>
-        <w:pStyle w:val="BodyText"/>
-      </w:pPr>
-      <w:r>
-        <w:t xml:space="preserve">================================================================================</w:t>
-      </w:r>
-    </w:p>
     <w:bookmarkEnd w:id="30"/>
     <w:bookmarkStart w:id="31" w:name="section-11-approval"/>
     <w:p>
@@ -1291,14 +1203,6 @@
         <w:t xml:space="preserve">- [ ] No approval needed</w:t>
       </w:r>
     </w:p>
-    <w:p>
-      <w:pPr>
-        <w:pStyle w:val="BodyText"/>
-      </w:pPr>
-      <w:r>
-        <w:t xml:space="preserve">================================================================================</w:t>
-      </w:r>
-    </w:p>
     <w:bookmarkEnd w:id="31"/>
     <w:bookmarkStart w:id="32" w:name="section-12-case-studies"/>
     <w:p>
@@ -1361,14 +1265,6 @@
       </w:r>
       <w:r>
         <w:t xml:space="preserve">- [ ] No</w:t>
-      </w:r>
-    </w:p>
-    <w:p>
-      <w:pPr>
-        <w:pStyle w:val="BodyText"/>
-      </w:pPr>
-      <w:r>
-        <w:t xml:space="preserve">================================================================================</w:t>
       </w:r>
     </w:p>
     <w:bookmarkEnd w:id="32"/>
@@ -1400,14 +1296,6 @@
         <w:pict>
           <v:rect style="width:0;height:1.5pt" o:hralign="center" o:hrstd="t" o:hr="t"/>
         </w:pict>
-      </w:r>
-    </w:p>
-    <w:p>
-      <w:pPr>
-        <w:pStyle w:val="FirstParagraph"/>
-      </w:pPr>
-      <w:r>
-        <w:t xml:space="preserve">================================================================================</w:t>
       </w:r>
     </w:p>
     <w:bookmarkEnd w:id="33"/>
@@ -1663,14 +1551,6 @@
         <w:pStyle w:val="BodyText"/>
       </w:pPr>
       <w:r>
-        <w:t xml:space="preserve">================================================================================</w:t>
-      </w:r>
-    </w:p>
-    <w:p>
-      <w:pPr>
-        <w:pStyle w:val="BodyText"/>
-      </w:pPr>
-      <w:r>
         <w:rPr>
           <w:bCs/>
           <w:b/>
@@ -1754,14 +1634,6 @@
       </w:r>
       <w:r>
         <w:t xml:space="preserve">$_____________________</w:t>
-      </w:r>
-    </w:p>
-    <w:p>
-      <w:pPr>
-        <w:pStyle w:val="BodyText"/>
-      </w:pPr>
-      <w:r>
-        <w:t xml:space="preserve">================================================================================</w:t>
       </w:r>
     </w:p>
     <w:p>

</xml_diff>